<commit_message>
summary of lecture 1 and 2 done for ACN
</commit_message>
<xml_diff>
--- a/Fall 2025/Advanced Computer Networks/Lecture 1/Summary.docx
+++ b/Fall 2025/Advanced Computer Networks/Lecture 1/Summary.docx
@@ -640,14 +640,7 @@
           <w:b/>
           <w:sz w:val="28"/>
         </w:rPr>
-        <w:t>IRTF</w:t>
-      </w:r>
-      <w:r>
-        <w:rPr>
-          <w:b/>
-          <w:sz w:val="28"/>
-        </w:rPr>
-        <w:t xml:space="preserve"> (Internet Research Task Force)</w:t>
+        <w:t>IRTF (Internet Research Task Force)</w:t>
       </w:r>
       <w:r>
         <w:rPr>
@@ -936,19 +929,7 @@
         <w:rPr>
           <w:sz w:val="28"/>
         </w:rPr>
-        <w:t>nformation transmitted by any node is received by every other</w:t>
-      </w:r>
-      <w:r>
-        <w:rPr>
-          <w:sz w:val="28"/>
-        </w:rPr>
-        <w:t xml:space="preserve"> </w:t>
-      </w:r>
-      <w:r>
-        <w:rPr>
-          <w:sz w:val="28"/>
-        </w:rPr>
-        <w:t>node in the network</w:t>
+        <w:t>nformation transmitted by any node is received by every other node in the network</w:t>
       </w:r>
       <w:r>
         <w:rPr>
@@ -1099,74 +1080,721 @@
         </w:rPr>
         <w:t>It runs in three phases - Circuit Establishment, Data transfer, Circuit termination. If circuit is not available, then it returns busy signal. E.g. Telephone networks, ISDN (Integrated Services Digital Networks).</w:t>
       </w:r>
+    </w:p>
+    <w:p>
+      <w:pPr>
+        <w:pStyle w:val="ListParagraph"/>
+        <w:numPr>
+          <w:ilvl w:val="1"/>
+          <w:numId w:val="3"/>
+        </w:numPr>
+        <w:spacing w:after="0"/>
+        <w:jc w:val="both"/>
+        <w:rPr>
+          <w:b/>
+          <w:sz w:val="28"/>
+        </w:rPr>
+      </w:pPr>
+      <w:r>
+        <w:rPr>
+          <w:b/>
+          <w:sz w:val="28"/>
+        </w:rPr>
+        <w:t>Packet-switched communication network</w:t>
+      </w:r>
+    </w:p>
+    <w:p>
+      <w:pPr>
+        <w:pStyle w:val="ListParagraph"/>
+        <w:spacing w:after="0"/>
+        <w:ind w:left="2160"/>
+        <w:jc w:val="both"/>
+        <w:rPr>
+          <w:b/>
+          <w:sz w:val="28"/>
+        </w:rPr>
+      </w:pPr>
+      <w:r>
+        <w:rPr>
+          <w:sz w:val="28"/>
+        </w:rPr>
+        <w:t xml:space="preserve">Data are sent as formatted bit-sequences, so-called packets. Packets have | Header | Data | Trailer | structure where header and trailer carry control information (e.g. destination address, checksum). Each packet is passed through the network from node to node along some path where at each node, the entire packet is received, stored briefly, and then forwarded to the next node. Use of meta-data/header is done to describe data and tell apart </w:t>
+      </w:r>
+      <w:proofErr w:type="spellStart"/>
+      <w:r>
+        <w:rPr>
+          <w:sz w:val="28"/>
+        </w:rPr>
+        <w:t>form</w:t>
+      </w:r>
+      <w:proofErr w:type="spellEnd"/>
+      <w:r>
+        <w:rPr>
+          <w:sz w:val="28"/>
+        </w:rPr>
+        <w:t xml:space="preserve"> one </w:t>
+      </w:r>
+      <w:proofErr w:type="spellStart"/>
+      <w:r>
+        <w:rPr>
+          <w:sz w:val="28"/>
+        </w:rPr>
+        <w:t>another.r</w:t>
+      </w:r>
+      <w:proofErr w:type="spellEnd"/>
+    </w:p>
+    <w:p>
+      <w:pPr>
+        <w:pStyle w:val="ListParagraph"/>
+        <w:numPr>
+          <w:ilvl w:val="2"/>
+          <w:numId w:val="3"/>
+        </w:numPr>
+        <w:spacing w:after="0"/>
+        <w:jc w:val="both"/>
+        <w:rPr>
+          <w:b/>
+          <w:sz w:val="28"/>
+        </w:rPr>
+      </w:pPr>
+      <w:r>
+        <w:rPr>
+          <w:b/>
+          <w:sz w:val="28"/>
+        </w:rPr>
+        <w:t>Datagram network</w:t>
+      </w:r>
+    </w:p>
+    <w:p>
+      <w:pPr>
+        <w:pStyle w:val="ListParagraph"/>
+        <w:spacing w:after="0"/>
+        <w:ind w:left="2880"/>
+        <w:jc w:val="both"/>
+        <w:rPr>
+          <w:b/>
+          <w:sz w:val="28"/>
+        </w:rPr>
+      </w:pPr>
+      <w:r>
+        <w:rPr>
+          <w:sz w:val="28"/>
+        </w:rPr>
+        <w:lastRenderedPageBreak/>
+        <w:t>Each packet is independently switched where each packet header contains destination address. No resources are reserved in advance either. E.g. IP Networks</w:t>
+      </w:r>
+    </w:p>
+    <w:p>
+      <w:pPr>
+        <w:pStyle w:val="ListParagraph"/>
+        <w:numPr>
+          <w:ilvl w:val="2"/>
+          <w:numId w:val="3"/>
+        </w:numPr>
+        <w:spacing w:after="0"/>
+        <w:jc w:val="both"/>
+        <w:rPr>
+          <w:b/>
+          <w:sz w:val="28"/>
+        </w:rPr>
+      </w:pPr>
+      <w:r>
+        <w:rPr>
+          <w:b/>
+          <w:sz w:val="28"/>
+        </w:rPr>
+        <w:t>Virtual circuit network</w:t>
+      </w:r>
+    </w:p>
+    <w:p>
+      <w:pPr>
+        <w:pStyle w:val="ListParagraph"/>
+        <w:spacing w:after="0"/>
+        <w:ind w:left="2880"/>
+        <w:jc w:val="both"/>
+        <w:rPr>
+          <w:sz w:val="28"/>
+        </w:rPr>
+      </w:pPr>
+      <w:r>
+        <w:rPr>
+          <w:sz w:val="28"/>
+        </w:rPr>
+        <w:t>Hybrid of circuit switching and packet switching where data is transmitted as packets and all packets from one packet stream are sent along a pre-established path (virtual circuit). Guarantees in-sequence delivery of packets. E.g. ATM Networks</w:t>
+      </w:r>
+      <w:r>
+        <w:rPr>
+          <w:sz w:val="28"/>
+        </w:rPr>
+        <w:t xml:space="preserve">. </w:t>
+      </w:r>
+    </w:p>
+    <w:p>
+      <w:pPr>
+        <w:pStyle w:val="ListParagraph"/>
+        <w:spacing w:after="0"/>
+        <w:ind w:left="2880"/>
+        <w:jc w:val="both"/>
+        <w:rPr>
+          <w:sz w:val="28"/>
+        </w:rPr>
+      </w:pPr>
+      <w:r>
+        <w:rPr>
+          <w:sz w:val="28"/>
+          <w:u w:val="single"/>
+        </w:rPr>
+        <w:t>VC establishment, data transfer, VC disconnect</w:t>
+      </w:r>
+      <w:r>
+        <w:rPr>
+          <w:sz w:val="28"/>
+        </w:rPr>
+        <w:t xml:space="preserve"> are the three</w:t>
+      </w:r>
+      <w:r>
+        <w:rPr>
+          <w:sz w:val="28"/>
+        </w:rPr>
+        <w:t xml:space="preserve"> phases of communication with virtual circuits.</w:t>
+      </w:r>
+    </w:p>
+    <w:p>
+      <w:pPr>
+        <w:spacing w:after="0"/>
+        <w:jc w:val="both"/>
+        <w:rPr>
+          <w:sz w:val="28"/>
+        </w:rPr>
+      </w:pPr>
+    </w:p>
+    <w:p>
+      <w:pPr>
+        <w:spacing w:after="0"/>
+        <w:jc w:val="both"/>
+        <w:rPr>
+          <w:b/>
+          <w:sz w:val="28"/>
+        </w:rPr>
+      </w:pPr>
+      <w:r>
+        <w:rPr>
+          <w:b/>
+          <w:sz w:val="28"/>
+        </w:rPr>
+        <w:t>Router Architecture in Packet Switching Networks</w:t>
+      </w:r>
+    </w:p>
+    <w:p>
+      <w:pPr>
+        <w:spacing w:after="0"/>
+        <w:jc w:val="both"/>
+        <w:rPr>
+          <w:b/>
+          <w:sz w:val="28"/>
+        </w:rPr>
+      </w:pPr>
+      <w:r>
+        <w:rPr>
+          <w:b/>
+          <w:sz w:val="28"/>
+        </w:rPr>
+        <w:t>Data Path</w:t>
+      </w:r>
+    </w:p>
+    <w:p>
+      <w:pPr>
+        <w:pStyle w:val="ListParagraph"/>
+        <w:numPr>
+          <w:ilvl w:val="0"/>
+          <w:numId w:val="4"/>
+        </w:numPr>
+        <w:spacing w:after="0"/>
+        <w:jc w:val="both"/>
+        <w:rPr>
+          <w:b/>
+          <w:sz w:val="28"/>
+        </w:rPr>
+      </w:pPr>
+      <w:r>
+        <w:rPr>
+          <w:sz w:val="28"/>
+        </w:rPr>
+        <w:t>All operations performed by a router on a packet as the packet propagates to its destination. E.g. Forwarding, buffer management, scheduling</w:t>
+      </w:r>
+    </w:p>
+    <w:p>
+      <w:pPr>
+        <w:pStyle w:val="ListParagraph"/>
+        <w:numPr>
+          <w:ilvl w:val="0"/>
+          <w:numId w:val="4"/>
+        </w:numPr>
+        <w:spacing w:after="0"/>
+        <w:jc w:val="both"/>
+        <w:rPr>
+          <w:b/>
+          <w:sz w:val="28"/>
+        </w:rPr>
+      </w:pPr>
+      <w:r>
+        <w:rPr>
+          <w:sz w:val="28"/>
+          <w:u w:val="single"/>
+        </w:rPr>
+        <w:t>Functions</w:t>
+      </w:r>
+      <w:r>
+        <w:rPr>
+          <w:sz w:val="28"/>
+          <w:u w:val="single"/>
+        </w:rPr>
+        <w:t xml:space="preserve"> by input interface</w:t>
+      </w:r>
+    </w:p>
+    <w:p>
+      <w:pPr>
+        <w:pStyle w:val="ListParagraph"/>
+        <w:numPr>
+          <w:ilvl w:val="1"/>
+          <w:numId w:val="4"/>
+        </w:numPr>
+        <w:spacing w:after="0"/>
+        <w:jc w:val="both"/>
+        <w:rPr>
+          <w:b/>
+          <w:sz w:val="28"/>
+          <w:u w:val="single"/>
+        </w:rPr>
+      </w:pPr>
+      <w:r>
+        <w:rPr>
+          <w:sz w:val="28"/>
+          <w:u w:val="single"/>
+        </w:rPr>
+        <w:t>Packet forwarding</w:t>
+      </w:r>
+    </w:p>
+    <w:p>
+      <w:pPr>
+        <w:pStyle w:val="ListParagraph"/>
+        <w:numPr>
+          <w:ilvl w:val="2"/>
+          <w:numId w:val="4"/>
+        </w:numPr>
+        <w:spacing w:after="0"/>
+        <w:jc w:val="both"/>
+        <w:rPr>
+          <w:b/>
+          <w:sz w:val="28"/>
+        </w:rPr>
+      </w:pPr>
+      <w:r>
+        <w:rPr>
+          <w:sz w:val="28"/>
+        </w:rPr>
+        <w:t>Decide to which output interface to forward each packet based on the information in packet header.</w:t>
+      </w:r>
+    </w:p>
+    <w:p>
+      <w:pPr>
+        <w:pStyle w:val="ListParagraph"/>
+        <w:numPr>
+          <w:ilvl w:val="0"/>
+          <w:numId w:val="4"/>
+        </w:numPr>
+        <w:spacing w:after="0"/>
+        <w:jc w:val="both"/>
+        <w:rPr>
+          <w:b/>
+          <w:sz w:val="28"/>
+        </w:rPr>
+      </w:pPr>
+      <w:r>
+        <w:rPr>
+          <w:sz w:val="28"/>
+          <w:u w:val="single"/>
+        </w:rPr>
+        <w:t>Functions by output interface</w:t>
+      </w:r>
+    </w:p>
+    <w:p>
+      <w:pPr>
+        <w:pStyle w:val="ListParagraph"/>
+        <w:numPr>
+          <w:ilvl w:val="1"/>
+          <w:numId w:val="4"/>
+        </w:numPr>
+        <w:spacing w:after="0"/>
+        <w:jc w:val="both"/>
+        <w:rPr>
+          <w:b/>
+          <w:sz w:val="28"/>
+          <w:u w:val="single"/>
+        </w:rPr>
+      </w:pPr>
+      <w:r>
+        <w:rPr>
+          <w:sz w:val="28"/>
+          <w:u w:val="single"/>
+        </w:rPr>
+        <w:t>Buffer management</w:t>
+      </w:r>
+    </w:p>
+    <w:p>
+      <w:pPr>
+        <w:pStyle w:val="ListParagraph"/>
+        <w:numPr>
+          <w:ilvl w:val="2"/>
+          <w:numId w:val="4"/>
+        </w:numPr>
+        <w:spacing w:after="0"/>
+        <w:jc w:val="both"/>
+        <w:rPr>
+          <w:b/>
+          <w:sz w:val="28"/>
+          <w:u w:val="single"/>
+        </w:rPr>
+      </w:pPr>
+      <w:r>
+        <w:rPr>
+          <w:sz w:val="28"/>
+        </w:rPr>
+        <w:t>Decide when and which packet to drop</w:t>
+      </w:r>
+    </w:p>
+    <w:p>
+      <w:pPr>
+        <w:pStyle w:val="ListParagraph"/>
+        <w:numPr>
+          <w:ilvl w:val="1"/>
+          <w:numId w:val="4"/>
+        </w:numPr>
+        <w:spacing w:after="0"/>
+        <w:jc w:val="both"/>
+        <w:rPr>
+          <w:b/>
+          <w:sz w:val="28"/>
+          <w:u w:val="single"/>
+        </w:rPr>
+      </w:pPr>
+      <w:r>
+        <w:rPr>
+          <w:sz w:val="28"/>
+          <w:u w:val="single"/>
+        </w:rPr>
+        <w:t>Scheduler</w:t>
+      </w:r>
+    </w:p>
+    <w:p>
+      <w:pPr>
+        <w:pStyle w:val="ListParagraph"/>
+        <w:numPr>
+          <w:ilvl w:val="2"/>
+          <w:numId w:val="4"/>
+        </w:numPr>
+        <w:spacing w:after="0"/>
+        <w:jc w:val="both"/>
+        <w:rPr>
+          <w:b/>
+          <w:sz w:val="28"/>
+          <w:u w:val="single"/>
+        </w:rPr>
+      </w:pPr>
+      <w:r>
+        <w:rPr>
+          <w:sz w:val="28"/>
+        </w:rPr>
+        <w:t>Decide when and which packet to transmit</w:t>
+      </w:r>
+    </w:p>
+    <w:p>
+      <w:pPr>
+        <w:pStyle w:val="ListParagraph"/>
+        <w:numPr>
+          <w:ilvl w:val="1"/>
+          <w:numId w:val="4"/>
+        </w:numPr>
+        <w:spacing w:after="0"/>
+        <w:jc w:val="both"/>
+        <w:rPr>
+          <w:b/>
+          <w:sz w:val="28"/>
+          <w:u w:val="single"/>
+        </w:rPr>
+      </w:pPr>
+      <w:r>
+        <w:rPr>
+          <w:sz w:val="28"/>
+          <w:u w:val="single"/>
+        </w:rPr>
+        <w:t>Packet classification</w:t>
+      </w:r>
+    </w:p>
+    <w:p>
+      <w:pPr>
+        <w:pStyle w:val="ListParagraph"/>
+        <w:numPr>
+          <w:ilvl w:val="2"/>
+          <w:numId w:val="4"/>
+        </w:numPr>
+        <w:spacing w:after="0"/>
+        <w:jc w:val="both"/>
+        <w:rPr>
+          <w:b/>
+          <w:sz w:val="28"/>
+          <w:u w:val="single"/>
+        </w:rPr>
+      </w:pPr>
+      <w:r>
+        <w:rPr>
+          <w:sz w:val="28"/>
+        </w:rPr>
+        <w:t>Map each packet to a predefined flow</w:t>
+      </w:r>
+    </w:p>
+    <w:p>
+      <w:pPr>
+        <w:pStyle w:val="ListParagraph"/>
+        <w:numPr>
+          <w:ilvl w:val="2"/>
+          <w:numId w:val="4"/>
+        </w:numPr>
+        <w:spacing w:after="0"/>
+        <w:jc w:val="both"/>
+        <w:rPr>
+          <w:b/>
+          <w:sz w:val="28"/>
+          <w:u w:val="single"/>
+        </w:rPr>
+      </w:pPr>
+      <w:r>
+        <w:rPr>
+          <w:sz w:val="28"/>
+        </w:rPr>
+        <w:t>Used to implement more sophisticated services.</w:t>
+      </w:r>
+    </w:p>
+    <w:p>
+      <w:pPr>
+        <w:spacing w:after="0"/>
+        <w:jc w:val="both"/>
+        <w:rPr>
+          <w:sz w:val="28"/>
+        </w:rPr>
+      </w:pPr>
+      <w:r>
+        <w:rPr>
+          <w:b/>
+          <w:sz w:val="28"/>
+        </w:rPr>
+        <w:t>Control Path</w:t>
+      </w:r>
+    </w:p>
+    <w:p>
+      <w:pPr>
+        <w:pStyle w:val="ListParagraph"/>
+        <w:numPr>
+          <w:ilvl w:val="0"/>
+          <w:numId w:val="4"/>
+        </w:numPr>
+        <w:spacing w:after="0"/>
+        <w:jc w:val="both"/>
+        <w:rPr>
+          <w:sz w:val="28"/>
+        </w:rPr>
+      </w:pPr>
+      <w:r>
+        <w:rPr>
+          <w:sz w:val="28"/>
+        </w:rPr>
+        <w:t>All operations required to set and maintain state in a router – state required to process packets on the data path. E.g. Routing protocols, signaling</w:t>
+      </w:r>
+    </w:p>
+    <w:p>
+      <w:pPr>
+        <w:pStyle w:val="ListParagraph"/>
+        <w:numPr>
+          <w:ilvl w:val="0"/>
+          <w:numId w:val="4"/>
+        </w:numPr>
+        <w:spacing w:after="0"/>
+        <w:jc w:val="both"/>
+        <w:rPr>
+          <w:sz w:val="28"/>
+        </w:rPr>
+      </w:pPr>
+      <w:r>
+        <w:rPr>
+          <w:sz w:val="28"/>
+          <w:u w:val="single"/>
+        </w:rPr>
+        <w:t>Routing protocol</w:t>
+      </w:r>
+    </w:p>
+    <w:p>
+      <w:pPr>
+        <w:pStyle w:val="ListParagraph"/>
+        <w:numPr>
+          <w:ilvl w:val="1"/>
+          <w:numId w:val="4"/>
+        </w:numPr>
+        <w:spacing w:after="0"/>
+        <w:jc w:val="both"/>
+        <w:rPr>
+          <w:sz w:val="28"/>
+        </w:rPr>
+      </w:pPr>
+      <w:r>
+        <w:rPr>
+          <w:sz w:val="28"/>
+        </w:rPr>
+        <w:t>Compute and set up routing tables</w:t>
+      </w:r>
+    </w:p>
+    <w:p>
+      <w:pPr>
+        <w:pStyle w:val="ListParagraph"/>
+        <w:numPr>
+          <w:ilvl w:val="0"/>
+          <w:numId w:val="4"/>
+        </w:numPr>
+        <w:spacing w:after="0"/>
+        <w:jc w:val="both"/>
+        <w:rPr>
+          <w:sz w:val="28"/>
+          <w:u w:val="single"/>
+        </w:rPr>
+      </w:pPr>
+      <w:r>
+        <w:rPr>
+          <w:sz w:val="28"/>
+          <w:u w:val="single"/>
+        </w:rPr>
+        <w:lastRenderedPageBreak/>
+        <w:t>Signaling protocol</w:t>
+      </w:r>
+    </w:p>
+    <w:p>
+      <w:pPr>
+        <w:pStyle w:val="ListParagraph"/>
+        <w:numPr>
+          <w:ilvl w:val="1"/>
+          <w:numId w:val="4"/>
+        </w:numPr>
+        <w:spacing w:after="0"/>
+        <w:jc w:val="both"/>
+        <w:rPr>
+          <w:sz w:val="28"/>
+          <w:u w:val="single"/>
+        </w:rPr>
+      </w:pPr>
+      <w:r>
+        <w:rPr>
+          <w:sz w:val="28"/>
+        </w:rPr>
+        <w:t>Setup reservations and flow state along the path to achieve better services (e.g. delay and bandwidth guarantees)</w:t>
+      </w:r>
+    </w:p>
+    <w:p>
+      <w:pPr>
+        <w:spacing w:after="0"/>
+        <w:jc w:val="both"/>
+        <w:rPr>
+          <w:b/>
+          <w:sz w:val="28"/>
+        </w:rPr>
+      </w:pPr>
+    </w:p>
+    <w:p>
+      <w:pPr>
+        <w:spacing w:after="0"/>
+        <w:jc w:val="both"/>
+        <w:rPr>
+          <w:b/>
+          <w:sz w:val="28"/>
+        </w:rPr>
+      </w:pPr>
+      <w:r>
+        <w:rPr>
+          <w:b/>
+          <w:sz w:val="28"/>
+        </w:rPr>
+        <w:t>Network Protocols</w:t>
+      </w:r>
+    </w:p>
+    <w:p>
+      <w:pPr>
+        <w:pStyle w:val="ListParagraph"/>
+        <w:numPr>
+          <w:ilvl w:val="0"/>
+          <w:numId w:val="5"/>
+        </w:numPr>
+        <w:spacing w:after="0"/>
+        <w:jc w:val="both"/>
+        <w:rPr>
+          <w:b/>
+          <w:sz w:val="28"/>
+        </w:rPr>
+      </w:pPr>
+      <w:r>
+        <w:rPr>
+          <w:sz w:val="28"/>
+        </w:rPr>
+        <w:t>Specify any function that requires cooperation between two or more network entities.</w:t>
+      </w:r>
+    </w:p>
+    <w:p>
+      <w:pPr>
+        <w:pStyle w:val="ListParagraph"/>
+        <w:numPr>
+          <w:ilvl w:val="0"/>
+          <w:numId w:val="5"/>
+        </w:numPr>
+        <w:spacing w:after="0"/>
+        <w:jc w:val="both"/>
+        <w:rPr>
+          <w:b/>
+          <w:sz w:val="28"/>
+        </w:rPr>
+      </w:pPr>
+      <w:proofErr w:type="spellStart"/>
+      <w:r>
+        <w:rPr>
+          <w:sz w:val="28"/>
+        </w:rPr>
+        <w:t>Specifiy</w:t>
+      </w:r>
+      <w:proofErr w:type="spellEnd"/>
+      <w:r>
+        <w:rPr>
+          <w:sz w:val="28"/>
+        </w:rPr>
+        <w:t xml:space="preserve"> the format of the information that is sent/received among routers and end-systems</w:t>
+      </w:r>
+    </w:p>
+    <w:p>
+      <w:pPr>
+        <w:pStyle w:val="ListParagraph"/>
+        <w:numPr>
+          <w:ilvl w:val="0"/>
+          <w:numId w:val="5"/>
+        </w:numPr>
+        <w:spacing w:after="0"/>
+        <w:jc w:val="both"/>
+        <w:rPr>
+          <w:b/>
+          <w:sz w:val="28"/>
+        </w:rPr>
+      </w:pPr>
+      <w:r>
+        <w:rPr>
+          <w:sz w:val="28"/>
+        </w:rPr>
+        <w:t>Specify timing and the actions that a node has to take when it receives special messages or special events occur.</w:t>
+      </w:r>
       <w:bookmarkStart w:id="0" w:name="_GoBack"/>
       <w:bookmarkEnd w:id="0"/>
-    </w:p>
-    <w:p>
-      <w:pPr>
-        <w:pStyle w:val="ListParagraph"/>
-        <w:numPr>
-          <w:ilvl w:val="1"/>
-          <w:numId w:val="3"/>
-        </w:numPr>
-        <w:spacing w:after="0"/>
-        <w:jc w:val="both"/>
-        <w:rPr>
-          <w:b/>
-          <w:sz w:val="28"/>
-        </w:rPr>
-      </w:pPr>
-      <w:r>
-        <w:rPr>
-          <w:b/>
-          <w:sz w:val="28"/>
-        </w:rPr>
-        <w:t>Packet-switched communication network</w:t>
-      </w:r>
-    </w:p>
-    <w:p>
-      <w:pPr>
-        <w:pStyle w:val="ListParagraph"/>
-        <w:numPr>
-          <w:ilvl w:val="2"/>
-          <w:numId w:val="3"/>
-        </w:numPr>
-        <w:spacing w:after="0"/>
-        <w:jc w:val="both"/>
-        <w:rPr>
-          <w:b/>
-          <w:sz w:val="28"/>
-        </w:rPr>
-      </w:pPr>
-      <w:r>
-        <w:rPr>
-          <w:b/>
-          <w:sz w:val="28"/>
-        </w:rPr>
-        <w:t>Datagram network</w:t>
-      </w:r>
-    </w:p>
-    <w:p>
-      <w:pPr>
-        <w:pStyle w:val="ListParagraph"/>
-        <w:numPr>
-          <w:ilvl w:val="2"/>
-          <w:numId w:val="3"/>
-        </w:numPr>
-        <w:spacing w:after="0"/>
-        <w:jc w:val="both"/>
-        <w:rPr>
-          <w:b/>
-          <w:sz w:val="28"/>
-        </w:rPr>
-      </w:pPr>
-      <w:r>
-        <w:rPr>
-          <w:b/>
-          <w:sz w:val="28"/>
-        </w:rPr>
-        <w:t>Virtual circuit network</w:t>
-      </w:r>
     </w:p>
     <w:sectPr>
       <w:pgSz w:w="12240" w:h="15840"/>
@@ -1297,7 +1925,7 @@
         <w:ind w:left="2160" w:hanging="180"/>
       </w:pPr>
     </w:lvl>
-    <w:lvl w:ilvl="3" w:tplc="0409000F" w:tentative="1">
+    <w:lvl w:ilvl="3" w:tplc="0409000F">
       <w:start w:val="1"/>
       <w:numFmt w:val="decimal"/>
       <w:lvlText w:val="%4."/>
@@ -1353,6 +1981,119 @@
     </w:lvl>
   </w:abstractNum>
   <w:abstractNum w:abstractNumId="2">
+    <w:nsid w:val="67142DEF"/>
+    <w:multiLevelType w:val="hybridMultilevel"/>
+    <w:tmpl w:val="AA0AD6A2"/>
+    <w:lvl w:ilvl="0" w:tplc="04090001">
+      <w:start w:val="1"/>
+      <w:numFmt w:val="bullet"/>
+      <w:lvlText w:val=""/>
+      <w:lvlJc w:val="left"/>
+      <w:pPr>
+        <w:ind w:left="720" w:hanging="360"/>
+      </w:pPr>
+      <w:rPr>
+        <w:rFonts w:ascii="Symbol" w:hAnsi="Symbol" w:hint="default"/>
+      </w:rPr>
+    </w:lvl>
+    <w:lvl w:ilvl="1" w:tplc="04090003" w:tentative="1">
+      <w:start w:val="1"/>
+      <w:numFmt w:val="bullet"/>
+      <w:lvlText w:val="o"/>
+      <w:lvlJc w:val="left"/>
+      <w:pPr>
+        <w:ind w:left="1440" w:hanging="360"/>
+      </w:pPr>
+      <w:rPr>
+        <w:rFonts w:ascii="Courier New" w:hAnsi="Courier New" w:cs="Courier New" w:hint="default"/>
+      </w:rPr>
+    </w:lvl>
+    <w:lvl w:ilvl="2" w:tplc="04090005" w:tentative="1">
+      <w:start w:val="1"/>
+      <w:numFmt w:val="bullet"/>
+      <w:lvlText w:val=""/>
+      <w:lvlJc w:val="left"/>
+      <w:pPr>
+        <w:ind w:left="2160" w:hanging="360"/>
+      </w:pPr>
+      <w:rPr>
+        <w:rFonts w:ascii="Wingdings" w:hAnsi="Wingdings" w:hint="default"/>
+      </w:rPr>
+    </w:lvl>
+    <w:lvl w:ilvl="3" w:tplc="04090001" w:tentative="1">
+      <w:start w:val="1"/>
+      <w:numFmt w:val="bullet"/>
+      <w:lvlText w:val=""/>
+      <w:lvlJc w:val="left"/>
+      <w:pPr>
+        <w:ind w:left="2880" w:hanging="360"/>
+      </w:pPr>
+      <w:rPr>
+        <w:rFonts w:ascii="Symbol" w:hAnsi="Symbol" w:hint="default"/>
+      </w:rPr>
+    </w:lvl>
+    <w:lvl w:ilvl="4" w:tplc="04090003" w:tentative="1">
+      <w:start w:val="1"/>
+      <w:numFmt w:val="bullet"/>
+      <w:lvlText w:val="o"/>
+      <w:lvlJc w:val="left"/>
+      <w:pPr>
+        <w:ind w:left="3600" w:hanging="360"/>
+      </w:pPr>
+      <w:rPr>
+        <w:rFonts w:ascii="Courier New" w:hAnsi="Courier New" w:cs="Courier New" w:hint="default"/>
+      </w:rPr>
+    </w:lvl>
+    <w:lvl w:ilvl="5" w:tplc="04090005" w:tentative="1">
+      <w:start w:val="1"/>
+      <w:numFmt w:val="bullet"/>
+      <w:lvlText w:val=""/>
+      <w:lvlJc w:val="left"/>
+      <w:pPr>
+        <w:ind w:left="4320" w:hanging="360"/>
+      </w:pPr>
+      <w:rPr>
+        <w:rFonts w:ascii="Wingdings" w:hAnsi="Wingdings" w:hint="default"/>
+      </w:rPr>
+    </w:lvl>
+    <w:lvl w:ilvl="6" w:tplc="04090001" w:tentative="1">
+      <w:start w:val="1"/>
+      <w:numFmt w:val="bullet"/>
+      <w:lvlText w:val=""/>
+      <w:lvlJc w:val="left"/>
+      <w:pPr>
+        <w:ind w:left="5040" w:hanging="360"/>
+      </w:pPr>
+      <w:rPr>
+        <w:rFonts w:ascii="Symbol" w:hAnsi="Symbol" w:hint="default"/>
+      </w:rPr>
+    </w:lvl>
+    <w:lvl w:ilvl="7" w:tplc="04090003" w:tentative="1">
+      <w:start w:val="1"/>
+      <w:numFmt w:val="bullet"/>
+      <w:lvlText w:val="o"/>
+      <w:lvlJc w:val="left"/>
+      <w:pPr>
+        <w:ind w:left="5760" w:hanging="360"/>
+      </w:pPr>
+      <w:rPr>
+        <w:rFonts w:ascii="Courier New" w:hAnsi="Courier New" w:cs="Courier New" w:hint="default"/>
+      </w:rPr>
+    </w:lvl>
+    <w:lvl w:ilvl="8" w:tplc="04090005" w:tentative="1">
+      <w:start w:val="1"/>
+      <w:numFmt w:val="bullet"/>
+      <w:lvlText w:val=""/>
+      <w:lvlJc w:val="left"/>
+      <w:pPr>
+        <w:ind w:left="6480" w:hanging="360"/>
+      </w:pPr>
+      <w:rPr>
+        <w:rFonts w:ascii="Wingdings" w:hAnsi="Wingdings" w:hint="default"/>
+      </w:rPr>
+    </w:lvl>
+  </w:abstractNum>
+  <w:abstractNum w:abstractNumId="3">
     <w:nsid w:val="6E6C75B9"/>
     <w:multiLevelType w:val="hybridMultilevel"/>
     <w:tmpl w:val="016CC592"/>
@@ -1465,14 +2206,133 @@
       </w:rPr>
     </w:lvl>
   </w:abstractNum>
+  <w:abstractNum w:abstractNumId="4">
+    <w:nsid w:val="773B5619"/>
+    <w:multiLevelType w:val="hybridMultilevel"/>
+    <w:tmpl w:val="D5CA33B6"/>
+    <w:lvl w:ilvl="0" w:tplc="04090001">
+      <w:start w:val="1"/>
+      <w:numFmt w:val="bullet"/>
+      <w:lvlText w:val=""/>
+      <w:lvlJc w:val="left"/>
+      <w:pPr>
+        <w:ind w:left="720" w:hanging="360"/>
+      </w:pPr>
+      <w:rPr>
+        <w:rFonts w:ascii="Symbol" w:hAnsi="Symbol" w:hint="default"/>
+      </w:rPr>
+    </w:lvl>
+    <w:lvl w:ilvl="1" w:tplc="04090003">
+      <w:start w:val="1"/>
+      <w:numFmt w:val="bullet"/>
+      <w:lvlText w:val="o"/>
+      <w:lvlJc w:val="left"/>
+      <w:pPr>
+        <w:ind w:left="1440" w:hanging="360"/>
+      </w:pPr>
+      <w:rPr>
+        <w:rFonts w:ascii="Courier New" w:hAnsi="Courier New" w:cs="Courier New" w:hint="default"/>
+      </w:rPr>
+    </w:lvl>
+    <w:lvl w:ilvl="2" w:tplc="04090005">
+      <w:start w:val="1"/>
+      <w:numFmt w:val="bullet"/>
+      <w:lvlText w:val=""/>
+      <w:lvlJc w:val="left"/>
+      <w:pPr>
+        <w:ind w:left="2160" w:hanging="360"/>
+      </w:pPr>
+      <w:rPr>
+        <w:rFonts w:ascii="Wingdings" w:hAnsi="Wingdings" w:hint="default"/>
+      </w:rPr>
+    </w:lvl>
+    <w:lvl w:ilvl="3" w:tplc="04090001" w:tentative="1">
+      <w:start w:val="1"/>
+      <w:numFmt w:val="bullet"/>
+      <w:lvlText w:val=""/>
+      <w:lvlJc w:val="left"/>
+      <w:pPr>
+        <w:ind w:left="2880" w:hanging="360"/>
+      </w:pPr>
+      <w:rPr>
+        <w:rFonts w:ascii="Symbol" w:hAnsi="Symbol" w:hint="default"/>
+      </w:rPr>
+    </w:lvl>
+    <w:lvl w:ilvl="4" w:tplc="04090003" w:tentative="1">
+      <w:start w:val="1"/>
+      <w:numFmt w:val="bullet"/>
+      <w:lvlText w:val="o"/>
+      <w:lvlJc w:val="left"/>
+      <w:pPr>
+        <w:ind w:left="3600" w:hanging="360"/>
+      </w:pPr>
+      <w:rPr>
+        <w:rFonts w:ascii="Courier New" w:hAnsi="Courier New" w:cs="Courier New" w:hint="default"/>
+      </w:rPr>
+    </w:lvl>
+    <w:lvl w:ilvl="5" w:tplc="04090005" w:tentative="1">
+      <w:start w:val="1"/>
+      <w:numFmt w:val="bullet"/>
+      <w:lvlText w:val=""/>
+      <w:lvlJc w:val="left"/>
+      <w:pPr>
+        <w:ind w:left="4320" w:hanging="360"/>
+      </w:pPr>
+      <w:rPr>
+        <w:rFonts w:ascii="Wingdings" w:hAnsi="Wingdings" w:hint="default"/>
+      </w:rPr>
+    </w:lvl>
+    <w:lvl w:ilvl="6" w:tplc="04090001" w:tentative="1">
+      <w:start w:val="1"/>
+      <w:numFmt w:val="bullet"/>
+      <w:lvlText w:val=""/>
+      <w:lvlJc w:val="left"/>
+      <w:pPr>
+        <w:ind w:left="5040" w:hanging="360"/>
+      </w:pPr>
+      <w:rPr>
+        <w:rFonts w:ascii="Symbol" w:hAnsi="Symbol" w:hint="default"/>
+      </w:rPr>
+    </w:lvl>
+    <w:lvl w:ilvl="7" w:tplc="04090003" w:tentative="1">
+      <w:start w:val="1"/>
+      <w:numFmt w:val="bullet"/>
+      <w:lvlText w:val="o"/>
+      <w:lvlJc w:val="left"/>
+      <w:pPr>
+        <w:ind w:left="5760" w:hanging="360"/>
+      </w:pPr>
+      <w:rPr>
+        <w:rFonts w:ascii="Courier New" w:hAnsi="Courier New" w:cs="Courier New" w:hint="default"/>
+      </w:rPr>
+    </w:lvl>
+    <w:lvl w:ilvl="8" w:tplc="04090005" w:tentative="1">
+      <w:start w:val="1"/>
+      <w:numFmt w:val="bullet"/>
+      <w:lvlText w:val=""/>
+      <w:lvlJc w:val="left"/>
+      <w:pPr>
+        <w:ind w:left="6480" w:hanging="360"/>
+      </w:pPr>
+      <w:rPr>
+        <w:rFonts w:ascii="Wingdings" w:hAnsi="Wingdings" w:hint="default"/>
+      </w:rPr>
+    </w:lvl>
+  </w:abstractNum>
   <w:num w:numId="1">
-    <w:abstractNumId w:val="2"/>
+    <w:abstractNumId w:val="3"/>
   </w:num>
   <w:num w:numId="2">
     <w:abstractNumId w:val="0"/>
   </w:num>
   <w:num w:numId="3">
     <w:abstractNumId w:val="1"/>
+  </w:num>
+  <w:num w:numId="4">
+    <w:abstractNumId w:val="4"/>
+  </w:num>
+  <w:num w:numId="5">
+    <w:abstractNumId w:val="2"/>
   </w:num>
 </w:numbering>
 </file>

</xml_diff>